<commit_message>
FinNex nişanı əlavə edildi
</commit_message>
<xml_diff>
--- a/FinNex.UI/wwwroot/Files/Word/Kredit/Arayis/DYP_arayis_girovdan_cixma.docx
+++ b/FinNex.UI/wwwroot/Files/Word/Kredit/Arayis/DYP_arayis_girovdan_cixma.docx
@@ -10,8 +10,6 @@
           <w:lang w:val="en-US"/>
         </w:rPr>
       </w:pPr>
-      <w:bookmarkStart w:id="0" w:name="_GoBack"/>
-      <w:bookmarkEnd w:id="0"/>
       <w:r>
         <w:rPr>
           <w:b/>
@@ -183,7 +181,41 @@
           <w:szCs w:val="36"/>
           <w:lang w:val="en-US"/>
         </w:rPr>
-        <w:t xml:space="preserve">                         Bank  Melli   Iran  Baku  branch</w:t>
+        <w:t xml:space="preserve">                         </w:t>
+      </w:r>
+      <w:proofErr w:type="gramStart"/>
+      <w:r>
+        <w:rPr>
+          <w:b/>
+          <w:color w:val="C00000"/>
+          <w:sz w:val="36"/>
+          <w:szCs w:val="36"/>
+          <w:lang w:val="en-US"/>
+        </w:rPr>
+        <w:t xml:space="preserve">Bank  </w:t>
+      </w:r>
+      <w:proofErr w:type="spellStart"/>
+      <w:r>
+        <w:rPr>
+          <w:b/>
+          <w:color w:val="C00000"/>
+          <w:sz w:val="36"/>
+          <w:szCs w:val="36"/>
+          <w:lang w:val="en-US"/>
+        </w:rPr>
+        <w:t>Melli</w:t>
+      </w:r>
+      <w:proofErr w:type="spellEnd"/>
+      <w:proofErr w:type="gramEnd"/>
+      <w:r>
+        <w:rPr>
+          <w:b/>
+          <w:color w:val="C00000"/>
+          <w:sz w:val="36"/>
+          <w:szCs w:val="36"/>
+          <w:lang w:val="en-US"/>
+        </w:rPr>
+        <w:t xml:space="preserve">   Iran  Baku  branch</w:t>
       </w:r>
     </w:p>
     <w:p>
@@ -380,15 +412,17 @@
           <w:color w:val="632423"/>
           <w:lang w:val="en-US"/>
         </w:rPr>
-        <w:t xml:space="preserve">               </w:t>
-      </w:r>
+        <w:t xml:space="preserve">            </w:t>
+      </w:r>
+      <w:bookmarkStart w:id="0" w:name="_GoBack"/>
+      <w:bookmarkEnd w:id="0"/>
       <w:r>
         <w:rPr>
           <w:b/>
           <w:color w:val="632423"/>
           <w:lang w:val="en-US"/>
         </w:rPr>
-        <w:t xml:space="preserve">    23,  </w:t>
+        <w:t xml:space="preserve"> 23,  </w:t>
       </w:r>
       <w:r>
         <w:rPr>
@@ -396,8 +430,18 @@
           <w:color w:val="632423"/>
           <w:lang w:val="en-US"/>
         </w:rPr>
-        <w:t>8 Noyabr</w:t>
-      </w:r>
+        <w:t xml:space="preserve">8 </w:t>
+      </w:r>
+      <w:proofErr w:type="spellStart"/>
+      <w:r>
+        <w:rPr>
+          <w:b/>
+          <w:color w:val="632423"/>
+          <w:lang w:val="en-US"/>
+        </w:rPr>
+        <w:t>Noyabr</w:t>
+      </w:r>
+      <w:proofErr w:type="spellEnd"/>
       <w:r>
         <w:rPr>
           <w:b/>
@@ -711,6 +755,7 @@
           <w:b/>
           <w:sz w:val="28"/>
           <w:szCs w:val="28"/>
+          <w:lang w:val="en-US"/>
         </w:rPr>
         <w:t xml:space="preserve">         </w:t>
       </w:r>
@@ -741,7 +786,29 @@
           <w:u w:val="single"/>
           <w:lang w:val="en-US"/>
         </w:rPr>
-        <w:t>{mekNo}</w:t>
+        <w:t>{</w:t>
+      </w:r>
+      <w:proofErr w:type="spellStart"/>
+      <w:r>
+        <w:rPr>
+          <w:rFonts w:ascii="Times Latin" w:hAnsi="Times Latin" w:cs="Microsoft Sans Serif"/>
+          <w:b/>
+          <w:szCs w:val="23"/>
+          <w:u w:val="single"/>
+          <w:lang w:val="en-US"/>
+        </w:rPr>
+        <w:t>mekNo</w:t>
+      </w:r>
+      <w:proofErr w:type="spellEnd"/>
+      <w:r>
+        <w:rPr>
+          <w:rFonts w:ascii="Times Latin" w:hAnsi="Times Latin" w:cs="Microsoft Sans Serif"/>
+          <w:b/>
+          <w:szCs w:val="23"/>
+          <w:u w:val="single"/>
+          <w:lang w:val="en-US"/>
+        </w:rPr>
+        <w:t>}</w:t>
       </w:r>
     </w:p>
     <w:p>
@@ -781,6 +848,7 @@
         </w:rPr>
         <w:t xml:space="preserve"> </w:t>
       </w:r>
+      <w:proofErr w:type="spellStart"/>
       <w:r>
         <w:rPr>
           <w:rFonts w:ascii="Times Latin" w:hAnsi="Times Latin" w:cs="Microsoft Sans Serif"/>
@@ -791,6 +859,7 @@
         </w:rPr>
         <w:t>il</w:t>
       </w:r>
+      <w:proofErr w:type="spellEnd"/>
     </w:p>
     <w:p>
       <w:pPr>
@@ -853,6 +922,7 @@
         </w:rPr>
         <w:t xml:space="preserve">                                                                   </w:t>
       </w:r>
+      <w:proofErr w:type="spellStart"/>
       <w:r>
         <w:rPr>
           <w:rFonts w:ascii="Times Latin" w:hAnsi="Times Latin" w:cs="Microsoft Sans Serif"/>
@@ -862,6 +932,7 @@
         </w:rPr>
         <w:t>Азярбайъан</w:t>
       </w:r>
+      <w:proofErr w:type="spellEnd"/>
       <w:r>
         <w:rPr>
           <w:rFonts w:ascii="Times Latin" w:hAnsi="Times Latin" w:cs="Microsoft Sans Serif"/>
@@ -872,6 +943,7 @@
         </w:rPr>
         <w:t xml:space="preserve"> </w:t>
       </w:r>
+      <w:proofErr w:type="spellStart"/>
       <w:r>
         <w:rPr>
           <w:rFonts w:ascii="Times Latin" w:hAnsi="Times Latin" w:cs="Microsoft Sans Serif"/>
@@ -881,6 +953,7 @@
         </w:rPr>
         <w:t>Республикасы</w:t>
       </w:r>
+      <w:proofErr w:type="spellEnd"/>
       <w:r>
         <w:rPr>
           <w:rFonts w:ascii="Times Latin" w:hAnsi="Times Latin" w:cs="Microsoft Sans Serif"/>
@@ -976,6 +1049,7 @@
         </w:rPr>
         <w:t>.-</w:t>
       </w:r>
+      <w:proofErr w:type="spellStart"/>
       <w:r>
         <w:rPr>
           <w:rFonts w:ascii="Times Latin" w:hAnsi="Times Latin" w:cs="Microsoft Sans Serif"/>
@@ -985,6 +1059,7 @@
         </w:rPr>
         <w:t>нин</w:t>
       </w:r>
+      <w:proofErr w:type="spellEnd"/>
       <w:r>
         <w:rPr>
           <w:rFonts w:ascii="Times Latin" w:hAnsi="Times Latin" w:cs="Microsoft Sans Serif"/>
@@ -1071,6 +1146,7 @@
         </w:rPr>
         <w:t>.-</w:t>
       </w:r>
+      <w:proofErr w:type="spellStart"/>
       <w:r>
         <w:rPr>
           <w:rFonts w:ascii="Times Latin" w:hAnsi="Times Latin" w:cs="Microsoft Sans Serif"/>
@@ -1080,6 +1156,7 @@
         </w:rPr>
         <w:t>ня</w:t>
       </w:r>
+      <w:proofErr w:type="spellEnd"/>
     </w:p>
     <w:p>
       <w:pPr>
@@ -1170,13 +1247,6 @@
       <w:r>
         <w:rPr>
           <w:rFonts w:ascii="Times Latin" w:hAnsi="Times Latin" w:cs="Microsoft Sans Serif"/>
-          <w:lang w:val="en-US"/>
-        </w:rPr>
-        <w:t xml:space="preserve"/>
-      </w:r>
-      <w:r>
-        <w:rPr>
-          <w:rFonts w:ascii="Times Latin" w:hAnsi="Times Latin" w:cs="Microsoft Sans Serif"/>
           <w:lang w:val="az-Latn-AZ"/>
         </w:rPr>
         <w:t xml:space="preserve"> ил тарихли </w:t>
@@ -1186,7 +1256,23 @@
           <w:rFonts w:ascii="Times Latin" w:hAnsi="Times Latin" w:cs="Microsoft Sans Serif"/>
           <w:lang w:val="en-US"/>
         </w:rPr>
-        <w:t>{muqNo}</w:t>
+        <w:t>{</w:t>
+      </w:r>
+      <w:proofErr w:type="spellStart"/>
+      <w:r>
+        <w:rPr>
+          <w:rFonts w:ascii="Times Latin" w:hAnsi="Times Latin" w:cs="Microsoft Sans Serif"/>
+          <w:lang w:val="en-US"/>
+        </w:rPr>
+        <w:t>muqNo</w:t>
+      </w:r>
+      <w:proofErr w:type="spellEnd"/>
+      <w:r>
+        <w:rPr>
+          <w:rFonts w:ascii="Times Latin" w:hAnsi="Times Latin" w:cs="Microsoft Sans Serif"/>
+          <w:lang w:val="en-US"/>
+        </w:rPr>
+        <w:t>}</w:t>
       </w:r>
       <w:r>
         <w:rPr>
@@ -1215,12 +1301,14 @@
         </w:rPr>
         <w:t xml:space="preserve"> </w:t>
       </w:r>
+      <w:proofErr w:type="spellStart"/>
       <w:r>
         <w:rPr>
           <w:rFonts w:ascii="Times Latin" w:hAnsi="Times Latin" w:cs="Microsoft Sans Serif"/>
         </w:rPr>
         <w:t>сайлы</w:t>
       </w:r>
+      <w:proofErr w:type="spellEnd"/>
       <w:r>
         <w:rPr>
           <w:rFonts w:ascii="Times Latin" w:hAnsi="Times Latin" w:cs="Microsoft Sans Serif"/>
@@ -1240,7 +1328,21 @@
           <w:rFonts w:ascii="A3 Times AzLat" w:hAnsi="A3 Times AzLat" w:cs="Microsoft Sans Serif"/>
           <w:bCs/>
         </w:rPr>
-        <w:t>она</w:t>
+        <w:t>о</w:t>
+      </w:r>
+      <w:r>
+        <w:rPr>
+          <w:rFonts w:ascii="Times Latin" w:hAnsi="Times Latin" w:cs="Microsoft Sans Serif"/>
+          <w:lang w:val="az-Latn-AZ"/>
+        </w:rPr>
+        <w:t>n</w:t>
+      </w:r>
+      <w:r>
+        <w:rPr>
+          <w:rFonts w:ascii="Times Latin" w:hAnsi="Times Latin" w:cs="Microsoft Sans Serif"/>
+          <w:lang w:val="az-Latn-AZ"/>
+        </w:rPr>
+        <w:t>а</w:t>
       </w:r>
       <w:r>
         <w:rPr>
@@ -1250,12 +1352,14 @@
         </w:rPr>
         <w:t xml:space="preserve"> </w:t>
       </w:r>
+      <w:proofErr w:type="spellStart"/>
       <w:r>
         <w:rPr>
           <w:rFonts w:ascii="Times Latin" w:hAnsi="Times Latin" w:cs="Microsoft Sans Serif"/>
         </w:rPr>
         <w:t>мяхсус</w:t>
       </w:r>
+      <w:proofErr w:type="spellEnd"/>
       <w:r>
         <w:rPr>
           <w:rFonts w:ascii="Times Latin" w:hAnsi="Times Latin" w:cs="Microsoft Sans Serif"/>
@@ -1268,7 +1372,23 @@
           <w:rFonts w:ascii="Times Latin" w:hAnsi="Times Latin" w:cs="Microsoft Sans Serif"/>
           <w:lang w:val="en-US"/>
         </w:rPr>
-        <w:t>{avtoNo}</w:t>
+        <w:t>{</w:t>
+      </w:r>
+      <w:proofErr w:type="spellStart"/>
+      <w:r>
+        <w:rPr>
+          <w:rFonts w:ascii="Times Latin" w:hAnsi="Times Latin" w:cs="Microsoft Sans Serif"/>
+          <w:lang w:val="en-US"/>
+        </w:rPr>
+        <w:t>avtoNo</w:t>
+      </w:r>
+      <w:proofErr w:type="spellEnd"/>
+      <w:r>
+        <w:rPr>
+          <w:rFonts w:ascii="Times Latin" w:hAnsi="Times Latin" w:cs="Microsoft Sans Serif"/>
+          <w:lang w:val="en-US"/>
+        </w:rPr>
+        <w:t>}</w:t>
       </w:r>
       <w:r>
         <w:rPr>
@@ -1299,7 +1419,23 @@
           <w:rFonts w:ascii="Times Latin" w:hAnsi="Times Latin" w:cs="Microsoft Sans Serif"/>
           <w:lang w:val="en-US"/>
         </w:rPr>
-        <w:t>{marka}</w:t>
+        <w:t>{</w:t>
+      </w:r>
+      <w:proofErr w:type="spellStart"/>
+      <w:r>
+        <w:rPr>
+          <w:rFonts w:ascii="Times Latin" w:hAnsi="Times Latin" w:cs="Microsoft Sans Serif"/>
+          <w:lang w:val="en-US"/>
+        </w:rPr>
+        <w:t>marka</w:t>
+      </w:r>
+      <w:proofErr w:type="spellEnd"/>
+      <w:r>
+        <w:rPr>
+          <w:rFonts w:ascii="Times Latin" w:hAnsi="Times Latin" w:cs="Microsoft Sans Serif"/>
+          <w:lang w:val="en-US"/>
+        </w:rPr>
+        <w:t>}</w:t>
       </w:r>
       <w:r>
         <w:rPr>
@@ -1309,12 +1445,14 @@
         </w:rPr>
         <w:t xml:space="preserve"> </w:t>
       </w:r>
+      <w:proofErr w:type="spellStart"/>
       <w:r>
         <w:rPr>
           <w:rFonts w:ascii="Times Latin" w:hAnsi="Times Latin" w:cs="Microsoft Sans Serif"/>
         </w:rPr>
         <w:t>миник</w:t>
       </w:r>
+      <w:proofErr w:type="spellEnd"/>
       <w:r>
         <w:rPr>
           <w:rFonts w:ascii="Times Latin" w:hAnsi="Times Latin" w:cs="Microsoft Sans Serif"/>
@@ -1327,14 +1465,46 @@
           <w:rFonts w:ascii="Times Latin" w:hAnsi="Times Latin" w:cs="Microsoft Sans Serif"/>
           <w:lang w:val="en-US"/>
         </w:rPr>
-        <w:t>{avtoil}</w:t>
-      </w:r>
-      <w:r>
-        <w:rPr>
-          <w:rFonts w:ascii="Times Latin" w:hAnsi="Times Latin" w:cs="Microsoft Sans Serif"/>
-          <w:lang w:val="en-US"/>
-        </w:rPr>
-        <w:t xml:space="preserve"> il </w:t>
+        <w:t>{</w:t>
+      </w:r>
+      <w:proofErr w:type="spellStart"/>
+      <w:r>
+        <w:rPr>
+          <w:rFonts w:ascii="Times Latin" w:hAnsi="Times Latin" w:cs="Microsoft Sans Serif"/>
+          <w:lang w:val="en-US"/>
+        </w:rPr>
+        <w:t>avtoil</w:t>
+      </w:r>
+      <w:proofErr w:type="spellEnd"/>
+      <w:r>
+        <w:rPr>
+          <w:rFonts w:ascii="Times Latin" w:hAnsi="Times Latin" w:cs="Microsoft Sans Serif"/>
+          <w:lang w:val="en-US"/>
+        </w:rPr>
+        <w:t>}</w:t>
+      </w:r>
+      <w:r>
+        <w:rPr>
+          <w:rFonts w:ascii="Times Latin" w:hAnsi="Times Latin" w:cs="Microsoft Sans Serif"/>
+          <w:lang w:val="en-US"/>
+        </w:rPr>
+        <w:t xml:space="preserve"> </w:t>
+      </w:r>
+      <w:proofErr w:type="spellStart"/>
+      <w:r>
+        <w:rPr>
+          <w:rFonts w:ascii="Times Latin" w:hAnsi="Times Latin" w:cs="Microsoft Sans Serif"/>
+          <w:lang w:val="en-US"/>
+        </w:rPr>
+        <w:t>il</w:t>
+      </w:r>
+      <w:proofErr w:type="spellEnd"/>
+      <w:r>
+        <w:rPr>
+          <w:rFonts w:ascii="Times Latin" w:hAnsi="Times Latin" w:cs="Microsoft Sans Serif"/>
+          <w:lang w:val="en-US"/>
+        </w:rPr>
+        <w:t xml:space="preserve"> </w:t>
       </w:r>
       <w:r>
         <w:rPr>
@@ -1355,7 +1525,23 @@
           <w:rFonts w:ascii="Times Latin" w:hAnsi="Times Latin" w:cs="Microsoft Sans Serif"/>
           <w:lang w:val="en-US"/>
         </w:rPr>
-        <w:t>{muh}</w:t>
+        <w:t>{</w:t>
+      </w:r>
+      <w:proofErr w:type="spellStart"/>
+      <w:r>
+        <w:rPr>
+          <w:rFonts w:ascii="Times Latin" w:hAnsi="Times Latin" w:cs="Microsoft Sans Serif"/>
+          <w:lang w:val="en-US"/>
+        </w:rPr>
+        <w:t>muh</w:t>
+      </w:r>
+      <w:proofErr w:type="spellEnd"/>
+      <w:r>
+        <w:rPr>
+          <w:rFonts w:ascii="Times Latin" w:hAnsi="Times Latin" w:cs="Microsoft Sans Serif"/>
+          <w:lang w:val="en-US"/>
+        </w:rPr>
+        <w:t>}</w:t>
       </w:r>
       <w:r>
         <w:rPr>
@@ -1398,7 +1584,23 @@
           <w:rFonts w:ascii="Times Latin" w:hAnsi="Times Latin" w:cs="Microsoft Sans Serif"/>
           <w:lang w:val="en-US"/>
         </w:rPr>
-        <w:t>{reng}</w:t>
+        <w:t>{</w:t>
+      </w:r>
+      <w:proofErr w:type="spellStart"/>
+      <w:r>
+        <w:rPr>
+          <w:rFonts w:ascii="Times Latin" w:hAnsi="Times Latin" w:cs="Microsoft Sans Serif"/>
+          <w:lang w:val="en-US"/>
+        </w:rPr>
+        <w:t>reng</w:t>
+      </w:r>
+      <w:proofErr w:type="spellEnd"/>
+      <w:r>
+        <w:rPr>
+          <w:rFonts w:ascii="Times Latin" w:hAnsi="Times Latin" w:cs="Microsoft Sans Serif"/>
+          <w:lang w:val="en-US"/>
+        </w:rPr>
+        <w:t>}</w:t>
       </w:r>
       <w:r>
         <w:rPr>
@@ -1407,12 +1609,14 @@
         </w:rPr>
         <w:t xml:space="preserve"> </w:t>
       </w:r>
+      <w:proofErr w:type="spellStart"/>
       <w:r>
         <w:rPr>
           <w:rFonts w:ascii="Times Latin" w:hAnsi="Times Latin" w:cs="Microsoft Sans Serif"/>
         </w:rPr>
         <w:t>рянэли</w:t>
       </w:r>
+      <w:proofErr w:type="spellEnd"/>
       <w:r>
         <w:rPr>
           <w:rFonts w:ascii="Times Latin" w:hAnsi="Times Latin" w:cs="Microsoft Sans Serif"/>
@@ -1438,6 +1642,7 @@
         <w:ind w:firstLine="792"/>
         <w:rPr>
           <w:rFonts w:ascii="Times Latin" w:hAnsi="Times Latin" w:cs="Microsoft Sans Serif"/>
+          <w:lang w:val="en-US"/>
         </w:rPr>
       </w:pPr>
       <w:r>
@@ -1458,6 +1663,7 @@
         <w:ind w:firstLine="792"/>
         <w:rPr>
           <w:rFonts w:ascii="Times Latin" w:hAnsi="Times Latin" w:cs="Microsoft Sans Serif"/>
+          <w:lang w:val="en-US"/>
         </w:rPr>
       </w:pPr>
       <w:r>
@@ -1482,6 +1688,7 @@
           <w:bCs/>
           <w:sz w:val="16"/>
           <w:szCs w:val="16"/>
+          <w:lang w:val="en-US"/>
         </w:rPr>
       </w:pPr>
     </w:p>
@@ -1499,6 +1706,7 @@
           <w:bCs/>
           <w:sz w:val="16"/>
           <w:szCs w:val="16"/>
+          <w:lang w:val="en-US"/>
         </w:rPr>
       </w:pPr>
     </w:p>
@@ -1516,6 +1724,7 @@
           <w:bCs/>
           <w:sz w:val="16"/>
           <w:szCs w:val="16"/>
+          <w:lang w:val="en-US"/>
         </w:rPr>
       </w:pPr>
     </w:p>
@@ -1533,6 +1742,7 @@
           <w:bCs/>
           <w:sz w:val="16"/>
           <w:szCs w:val="16"/>
+          <w:lang w:val="en-US"/>
         </w:rPr>
       </w:pPr>
     </w:p>
@@ -1550,6 +1760,7 @@
           <w:bCs/>
           <w:sz w:val="16"/>
           <w:szCs w:val="16"/>
+          <w:lang w:val="en-US"/>
         </w:rPr>
       </w:pPr>
     </w:p>
@@ -2371,6 +2582,50 @@
     <w:lsdException w:name="Subtitle" w:qFormat="1"/>
     <w:lsdException w:name="Strong" w:qFormat="1"/>
     <w:lsdException w:name="Emphasis" w:qFormat="1"/>
+    <w:lsdException w:name="Normal Table" w:semiHidden="1" w:unhideWhenUsed="1"/>
+    <w:lsdException w:name="Table Simple 1" w:semiHidden="1" w:unhideWhenUsed="1"/>
+    <w:lsdException w:name="Table Simple 2" w:semiHidden="1" w:unhideWhenUsed="1"/>
+    <w:lsdException w:name="Table Simple 3" w:semiHidden="1" w:unhideWhenUsed="1"/>
+    <w:lsdException w:name="Table Classic 1" w:semiHidden="1" w:unhideWhenUsed="1"/>
+    <w:lsdException w:name="Table Classic 2" w:semiHidden="1" w:unhideWhenUsed="1"/>
+    <w:lsdException w:name="Table Classic 3" w:semiHidden="1" w:unhideWhenUsed="1"/>
+    <w:lsdException w:name="Table Classic 4" w:semiHidden="1" w:unhideWhenUsed="1"/>
+    <w:lsdException w:name="Table Colorful 1" w:semiHidden="1" w:unhideWhenUsed="1"/>
+    <w:lsdException w:name="Table Colorful 2" w:semiHidden="1" w:unhideWhenUsed="1"/>
+    <w:lsdException w:name="Table Colorful 3" w:semiHidden="1" w:unhideWhenUsed="1"/>
+    <w:lsdException w:name="Table Columns 1" w:semiHidden="1" w:unhideWhenUsed="1"/>
+    <w:lsdException w:name="Table Columns 2" w:semiHidden="1" w:unhideWhenUsed="1"/>
+    <w:lsdException w:name="Table Columns 3" w:semiHidden="1" w:unhideWhenUsed="1"/>
+    <w:lsdException w:name="Table Columns 4" w:semiHidden="1" w:unhideWhenUsed="1"/>
+    <w:lsdException w:name="Table Columns 5" w:semiHidden="1" w:unhideWhenUsed="1"/>
+    <w:lsdException w:name="Table Grid 1" w:semiHidden="1" w:unhideWhenUsed="1"/>
+    <w:lsdException w:name="Table Grid 2" w:semiHidden="1" w:unhideWhenUsed="1"/>
+    <w:lsdException w:name="Table Grid 3" w:semiHidden="1" w:unhideWhenUsed="1"/>
+    <w:lsdException w:name="Table Grid 4" w:semiHidden="1" w:unhideWhenUsed="1"/>
+    <w:lsdException w:name="Table Grid 5" w:semiHidden="1" w:unhideWhenUsed="1"/>
+    <w:lsdException w:name="Table Grid 6" w:semiHidden="1" w:unhideWhenUsed="1"/>
+    <w:lsdException w:name="Table Grid 7" w:semiHidden="1" w:unhideWhenUsed="1"/>
+    <w:lsdException w:name="Table Grid 8" w:semiHidden="1" w:unhideWhenUsed="1"/>
+    <w:lsdException w:name="Table List 1" w:semiHidden="1" w:unhideWhenUsed="1"/>
+    <w:lsdException w:name="Table List 2" w:semiHidden="1" w:unhideWhenUsed="1"/>
+    <w:lsdException w:name="Table List 3" w:semiHidden="1" w:unhideWhenUsed="1"/>
+    <w:lsdException w:name="Table List 4" w:semiHidden="1" w:unhideWhenUsed="1"/>
+    <w:lsdException w:name="Table List 5" w:semiHidden="1" w:unhideWhenUsed="1"/>
+    <w:lsdException w:name="Table List 6" w:semiHidden="1" w:unhideWhenUsed="1"/>
+    <w:lsdException w:name="Table List 7" w:semiHidden="1" w:unhideWhenUsed="1"/>
+    <w:lsdException w:name="Table List 8" w:semiHidden="1" w:unhideWhenUsed="1"/>
+    <w:lsdException w:name="Table 3D effects 1" w:semiHidden="1" w:unhideWhenUsed="1"/>
+    <w:lsdException w:name="Table 3D effects 2" w:semiHidden="1" w:unhideWhenUsed="1"/>
+    <w:lsdException w:name="Table 3D effects 3" w:semiHidden="1" w:unhideWhenUsed="1"/>
+    <w:lsdException w:name="Table Contemporary" w:semiHidden="1" w:unhideWhenUsed="1"/>
+    <w:lsdException w:name="Table Elegant" w:semiHidden="1" w:unhideWhenUsed="1"/>
+    <w:lsdException w:name="Table Professional" w:semiHidden="1" w:unhideWhenUsed="1"/>
+    <w:lsdException w:name="Table Subtle 1" w:semiHidden="1" w:unhideWhenUsed="1"/>
+    <w:lsdException w:name="Table Subtle 2" w:semiHidden="1" w:unhideWhenUsed="1"/>
+    <w:lsdException w:name="Table Web 1" w:semiHidden="1" w:unhideWhenUsed="1"/>
+    <w:lsdException w:name="Table Web 2" w:semiHidden="1" w:unhideWhenUsed="1"/>
+    <w:lsdException w:name="Table Web 3" w:semiHidden="1" w:unhideWhenUsed="1"/>
+    <w:lsdException w:name="Table Theme" w:semiHidden="1" w:unhideWhenUsed="1"/>
     <w:lsdException w:name="Placeholder Text" w:semiHidden="1" w:uiPriority="99"/>
     <w:lsdException w:name="No Spacing" w:uiPriority="1" w:qFormat="1"/>
     <w:lsdException w:name="Light Shading" w:uiPriority="60"/>
@@ -2680,11 +2935,15 @@
   </w:style>
   <w:style w:type="character" w:default="1" w:styleId="DefaultParagraphFont">
     <w:name w:val="Default Paragraph Font"/>
+    <w:uiPriority w:val="1"/>
     <w:semiHidden/>
+    <w:unhideWhenUsed/>
   </w:style>
   <w:style w:type="table" w:default="1" w:styleId="TableNormal">
     <w:name w:val="Normal Table"/>
+    <w:uiPriority w:val="99"/>
     <w:semiHidden/>
+    <w:unhideWhenUsed/>
     <w:tblPr>
       <w:tblInd w:w="0" w:type="dxa"/>
       <w:tblCellMar>
@@ -2697,7 +2956,9 @@
   </w:style>
   <w:style w:type="numbering" w:default="1" w:styleId="NoList">
     <w:name w:val="No List"/>
+    <w:uiPriority w:val="99"/>
     <w:semiHidden/>
+    <w:unhideWhenUsed/>
   </w:style>
   <w:style w:type="paragraph" w:styleId="BodyText">
     <w:name w:val="Body Text"/>
@@ -3066,7 +3327,7 @@
 </file>
 
 <file path=customXml/itemProps1.xml><?xml version="1.0" encoding="utf-8"?>
-<ds:datastoreItem xmlns:ds="http://schemas.openxmlformats.org/officeDocument/2006/customXml" ds:itemID="{BC630E95-2201-43EB-A5A2-F3BCEACEE6A3}">
+<ds:datastoreItem xmlns:ds="http://schemas.openxmlformats.org/officeDocument/2006/customXml" ds:itemID="{86EA3C23-5DE9-4680-934C-749DBAB56183}">
   <ds:schemaRefs>
     <ds:schemaRef ds:uri="http://schemas.openxmlformats.org/officeDocument/2006/bibliography"/>
   </ds:schemaRefs>

</xml_diff>